<commit_message>
Forward NAC role as RADIUS Filter-Id, surface it in logs and docs
- Read the usergroup field from the Mist nac-accounting event and
  encode it as the standard Filter-Id attribute (code 11) in every
  RADIUS Accounting-Request packet, when present.
- Include usergroup in the activity log line, the RADIUS-forwarded
  confirmation log, and the error log entry on a failed send, so role
  is visible for both routine monitoring and failure triage.
- Update the install guide and README: new Filter-Id row in the
  attribute table, a FortiGate section on using Filter-Id for
  role-based policy, and a troubleshooting entry for a missing role.

Co-Authored-By: Claude Sonnet 5 <noreply@anthropic.com>
</commit_message>
<xml_diff>
--- a/Mist_NAC_RADIUS_Guide.docx
+++ b/Mist_NAC_RADIUS_Guide.docx
@@ -47,7 +47,7 @@
           <w:sz w:val="24"/>
           <w:szCs w:val="24"/>
         </w:rPr>
-        <w:t xml:space="preserve">Version 2.0</w:t>
+        <w:t xml:space="preserve">Version 2.1</w:t>
       </w:r>
     </w:p>
     <w:p>
@@ -160,37 +160,47 @@
         <w:spacing w:after="160"/>
       </w:pPr>
       <w:r>
-        <w:t xml:space="preserve">This version (2.0) covers three changes since the original release: </w:t>
+        <w:t xml:space="preserve">Version 2.0 moved </w:t>
       </w:r>
       <w:r>
         <w:rPr>
           <w:b/>
           <w:bCs/>
         </w:rPr>
-        <w:t xml:space="preserve">configuration has moved out of the script and into an INI file</w:t>
-      </w:r>
-      <w:r>
-        <w:t xml:space="preserve">, the service </w:t>
+        <w:t xml:space="preserve">configuration out of the script and into an INI file</w:t>
+      </w:r>
+      <w:r>
+        <w:t xml:space="preserve">, added </w:t>
       </w:r>
       <w:r>
         <w:rPr>
           <w:b/>
           <w:bCs/>
         </w:rPr>
-        <w:t xml:space="preserve">handles concurrent requests and recovers automatically from failures</w:t>
-      </w:r>
-      <w:r>
-        <w:t xml:space="preserve">, and </w:t>
+        <w:t xml:space="preserve">concurrent request handling and automatic recovery from failures</w:t>
+      </w:r>
+      <w:r>
+        <w:t xml:space="preserve">, and added a </w:t>
       </w:r>
       <w:r>
         <w:rPr>
           <w:b/>
           <w:bCs/>
         </w:rPr>
-        <w:t xml:space="preserve">errors are now written to a dedicated log file</w:t>
-      </w:r>
-      <w:r>
-        <w:t xml:space="preserve"> so nothing is lost when running headless. See section 8 for details.</w:t>
+        <w:t xml:space="preserve">dedicated error log</w:t>
+      </w:r>
+      <w:r>
+        <w:t xml:space="preserve"> for headless deployments (section 8). Version 2.1 adds forwarding of the NAC </w:t>
+      </w:r>
+      <w:r>
+        <w:rPr>
+          <w:b/>
+          <w:bCs/>
+        </w:rPr>
+        <w:t xml:space="preserve">role / user group as the RADIUS Filter-Id attribute</w:t>
+      </w:r>
+      <w:r>
+        <w:t xml:space="preserve"> (section 1.3), and surfaces it in both log files (section 8.3).</w:t>
       </w:r>
     </w:p>
     <w:p>
@@ -2073,6 +2083,170 @@
                 <w:sz w:val="19"/>
                 <w:szCs w:val="19"/>
               </w:rPr>
+              <w:t xml:space="preserve">Filter-Id</w:t>
+            </w:r>
+          </w:p>
+        </w:tc>
+        <w:tc>
+          <w:tcPr>
+            <w:tcW w:type="dxa" w:w="900"/>
+            <w:tcBorders>
+              <w:top w:val="single" w:color="BFBFBF" w:sz="2"/>
+              <w:left w:val="single" w:color="BFBFBF" w:sz="2"/>
+              <w:bottom w:val="single" w:color="BFBFBF" w:sz="2"/>
+              <w:right w:val="single" w:color="BFBFBF" w:sz="2"/>
+            </w:tcBorders>
+            <w:tcMar>
+              <w:top w:type="dxa" w:w="60"/>
+              <w:left w:type="dxa" w:w="100"/>
+              <w:bottom w:type="dxa" w:w="60"/>
+              <w:right w:type="dxa" w:w="100"/>
+            </w:tcMar>
+            <w:vAlign w:val="center"/>
+          </w:tcPr>
+          <w:p>
+            <w:r>
+              <w:rPr>
+                <w:sz w:val="19"/>
+                <w:szCs w:val="19"/>
+              </w:rPr>
+              <w:t xml:space="preserve">11</w:t>
+            </w:r>
+          </w:p>
+        </w:tc>
+        <w:tc>
+          <w:tcPr>
+            <w:tcW w:type="dxa" w:w="900"/>
+            <w:tcBorders>
+              <w:top w:val="single" w:color="BFBFBF" w:sz="2"/>
+              <w:left w:val="single" w:color="BFBFBF" w:sz="2"/>
+              <w:bottom w:val="single" w:color="BFBFBF" w:sz="2"/>
+              <w:right w:val="single" w:color="BFBFBF" w:sz="2"/>
+            </w:tcBorders>
+            <w:tcMar>
+              <w:top w:type="dxa" w:w="60"/>
+              <w:left w:type="dxa" w:w="100"/>
+              <w:bottom w:type="dxa" w:w="60"/>
+              <w:right w:type="dxa" w:w="100"/>
+            </w:tcMar>
+            <w:vAlign w:val="center"/>
+          </w:tcPr>
+          <w:p>
+            <w:r>
+              <w:rPr>
+                <w:sz w:val="19"/>
+                <w:szCs w:val="19"/>
+              </w:rPr>
+              <w:t xml:space="preserve">✓</w:t>
+            </w:r>
+          </w:p>
+        </w:tc>
+        <w:tc>
+          <w:tcPr>
+            <w:tcW w:type="dxa" w:w="900"/>
+            <w:tcBorders>
+              <w:top w:val="single" w:color="BFBFBF" w:sz="2"/>
+              <w:left w:val="single" w:color="BFBFBF" w:sz="2"/>
+              <w:bottom w:val="single" w:color="BFBFBF" w:sz="2"/>
+              <w:right w:val="single" w:color="BFBFBF" w:sz="2"/>
+            </w:tcBorders>
+            <w:tcMar>
+              <w:top w:type="dxa" w:w="60"/>
+              <w:left w:type="dxa" w:w="100"/>
+              <w:bottom w:type="dxa" w:w="60"/>
+              <w:right w:type="dxa" w:w="100"/>
+            </w:tcMar>
+            <w:vAlign w:val="center"/>
+          </w:tcPr>
+          <w:p>
+            <w:r>
+              <w:rPr>
+                <w:sz w:val="19"/>
+                <w:szCs w:val="19"/>
+              </w:rPr>
+              <w:t xml:space="preserve">✓</w:t>
+            </w:r>
+          </w:p>
+        </w:tc>
+        <w:tc>
+          <w:tcPr>
+            <w:tcW w:type="dxa" w:w="900"/>
+            <w:tcBorders>
+              <w:top w:val="single" w:color="BFBFBF" w:sz="2"/>
+              <w:left w:val="single" w:color="BFBFBF" w:sz="2"/>
+              <w:bottom w:val="single" w:color="BFBFBF" w:sz="2"/>
+              <w:right w:val="single" w:color="BFBFBF" w:sz="2"/>
+            </w:tcBorders>
+            <w:tcMar>
+              <w:top w:type="dxa" w:w="60"/>
+              <w:left w:type="dxa" w:w="100"/>
+              <w:bottom w:type="dxa" w:w="60"/>
+              <w:right w:type="dxa" w:w="100"/>
+            </w:tcMar>
+            <w:vAlign w:val="center"/>
+          </w:tcPr>
+          <w:p>
+            <w:r>
+              <w:rPr>
+                <w:sz w:val="19"/>
+                <w:szCs w:val="19"/>
+              </w:rPr>
+              <w:t xml:space="preserve">✓</w:t>
+            </w:r>
+          </w:p>
+        </w:tc>
+        <w:tc>
+          <w:tcPr>
+            <w:tcW w:type="dxa" w:w="3400"/>
+            <w:tcBorders>
+              <w:top w:val="single" w:color="BFBFBF" w:sz="2"/>
+              <w:left w:val="single" w:color="BFBFBF" w:sz="2"/>
+              <w:bottom w:val="single" w:color="BFBFBF" w:sz="2"/>
+              <w:right w:val="single" w:color="BFBFBF" w:sz="2"/>
+            </w:tcBorders>
+            <w:tcMar>
+              <w:top w:type="dxa" w:w="60"/>
+              <w:left w:type="dxa" w:w="100"/>
+              <w:bottom w:type="dxa" w:w="60"/>
+              <w:right w:type="dxa" w:w="100"/>
+            </w:tcMar>
+            <w:vAlign w:val="center"/>
+          </w:tcPr>
+          <w:p>
+            <w:r>
+              <w:rPr>
+                <w:sz w:val="19"/>
+                <w:szCs w:val="19"/>
+              </w:rPr>
+              <w:t xml:space="preserve">usergroup (NAC role) — omitted if not present in the event</w:t>
+            </w:r>
+          </w:p>
+        </w:tc>
+      </w:tr>
+      <w:tr>
+        <w:tc>
+          <w:tcPr>
+            <w:tcW w:type="dxa" w:w="2400"/>
+            <w:tcBorders>
+              <w:top w:val="single" w:color="BFBFBF" w:sz="2"/>
+              <w:left w:val="single" w:color="BFBFBF" w:sz="2"/>
+              <w:bottom w:val="single" w:color="BFBFBF" w:sz="2"/>
+              <w:right w:val="single" w:color="BFBFBF" w:sz="2"/>
+            </w:tcBorders>
+            <w:tcMar>
+              <w:top w:type="dxa" w:w="60"/>
+              <w:left w:type="dxa" w:w="100"/>
+              <w:bottom w:type="dxa" w:w="60"/>
+              <w:right w:type="dxa" w:w="100"/>
+            </w:tcMar>
+            <w:vAlign w:val="center"/>
+          </w:tcPr>
+          <w:p>
+            <w:r>
+              <w:rPr>
+                <w:sz w:val="19"/>
+                <w:szCs w:val="19"/>
+              </w:rPr>
               <w:t xml:space="preserve">Framed-IP-Address</w:t>
             </w:r>
           </w:p>
@@ -3221,6 +3395,26 @@
       </w:r>
       <w:r>
         <w:t xml:space="preserve">Mist does not include the client IP in the START event. FortiGate RSSO will use the Calling-Station-Id (MAC) for initial identity binding and add the IP when the first UPDATE or STOP is received.</w:t>
+      </w:r>
+    </w:p>
+    <w:p>
+      <w:pPr>
+        <w:pBdr>
+          <w:left w:val="single" w:color="BF9000" w:sz="12"/>
+        </w:pBdr>
+        <w:shd w:fill="FFF2CC" w:val="clear"/>
+        <w:spacing w:after="200" w:before="80"/>
+        <w:ind w:left="120"/>
+      </w:pPr>
+      <w:r>
+        <w:rPr>
+          <w:b/>
+          <w:bCs/>
+        </w:rPr>
+        <w:t xml:space="preserve">Note: </w:t>
+      </w:r>
+      <w:r>
+        <w:t xml:space="preserve">Filter-Id carries the Mist NAC role (the usergroup field from the webhook event, e.g. a WxLAN/NAC policy label such as "Employees" or "Contractors"). It's a widely-supported RADIUS attribute for conveying group/role to a NAS device — see section 6.4 for how to use it on the FortiGate side.</w:t>
       </w:r>
     </w:p>
     <w:p>
@@ -6040,6 +6234,26 @@
     </w:p>
     <w:p>
       <w:pPr>
+        <w:pBdr>
+          <w:left w:val="single" w:color="BF9000" w:sz="12"/>
+        </w:pBdr>
+        <w:shd w:fill="FFF2CC" w:val="clear"/>
+        <w:spacing w:after="200" w:before="80"/>
+        <w:ind w:left="120"/>
+      </w:pPr>
+      <w:r>
+        <w:rPr>
+          <w:b/>
+          <w:bCs/>
+        </w:rPr>
+        <w:t xml:space="preserve">Note: </w:t>
+      </w:r>
+      <w:r>
+        <w:t xml:space="preserve">The usergroup field used for Filter-Id (section 1.3) comes from Mist's NAC policy match on the client session — it is only present if your NAC rule / WxLAN policy actually assigns a user group. If Filter-Id is missing from the RADIUS packets, check the NAC policy configuration in Mist rather than this service.</w:t>
+      </w:r>
+    </w:p>
+    <w:p>
+      <w:pPr>
         <w:pStyle w:val="Heading1"/>
         <w:spacing w:after="160" w:before="360"/>
       </w:pPr>
@@ -6897,6 +7111,51 @@
     </w:p>
     <w:p>
       <w:pPr>
+        <w:pStyle w:val="Heading2"/>
+        <w:spacing w:after="120" w:before="280"/>
+      </w:pPr>
+      <w:r>
+        <w:rPr>
+          <w:rFonts w:ascii="Arial" w:cs="Arial" w:eastAsia="Arial" w:hAnsi="Arial"/>
+          <w:b/>
+          <w:bCs/>
+          <w:color w:val="1F3864"/>
+          <w:sz w:val="26"/>
+          <w:szCs w:val="26"/>
+        </w:rPr>
+        <w:t xml:space="preserve">6.4 Role-Based Policy via Filter-Id (Optional)</w:t>
+      </w:r>
+    </w:p>
+    <w:p>
+      <w:pPr>
+        <w:spacing w:after="160"/>
+      </w:pPr>
+      <w:r>
+        <w:t xml:space="preserve">As of version 2.1, every RADIUS Accounting packet also carries the client's Mist NAC role in the standard Filter-Id attribute (code 11) — see section 1.3. Filter-Id is a long-standing, widely-supported RADIUS attribute for conveying a group or role to a NAS device, but FortiGate's exact handling of it (RSSO group filters vs. RADIUS server group matching) varies by FortiOS version.</w:t>
+      </w:r>
+    </w:p>
+    <w:p>
+      <w:pPr>
+        <w:pBdr>
+          <w:left w:val="single" w:color="BF9000" w:sz="12"/>
+        </w:pBdr>
+        <w:shd w:fill="FFF2CC" w:val="clear"/>
+        <w:spacing w:after="200" w:before="80"/>
+        <w:ind w:left="120"/>
+      </w:pPr>
+      <w:r>
+        <w:rPr>
+          <w:b/>
+          <w:bCs/>
+        </w:rPr>
+        <w:t xml:space="preserve">Note: </w:t>
+      </w:r>
+      <w:r>
+        <w:t xml:space="preserve">Confirm the correct configuration path for your FortiOS release before relying on Filter-Id for policy decisions. As a first step, capture a packet as in section 9.2 and confirm the Filter-Id attribute and its value (the Mist usergroup) are present and correct, then consult FortiGate's RADIUS/RSSO documentation for your FortiOS version on mapping Filter-Id to a firewall group.</w:t>
+      </w:r>
+    </w:p>
+    <w:p>
+      <w:pPr>
         <w:pStyle w:val="Heading1"/>
         <w:spacing w:after="160" w:before="360"/>
       </w:pPr>
@@ -7978,7 +8237,7 @@
         <w:spacing w:after="160"/>
       </w:pPr>
       <w:r>
-        <w:t xml:space="preserve">The service writes two separate daily-rotating log files into log_dir:</w:t>
+        <w:t xml:space="preserve">The service writes two separate daily-rotating log files into log_dir. Both include the client's usergroup (Mist NAC role) alongside the rest of the event/session detail:</w:t>
       </w:r>
     </w:p>
     <w:tbl>
@@ -8115,7 +8374,7 @@
                 <w:sz w:val="19"/>
                 <w:szCs w:val="19"/>
               </w:rPr>
-              <w:t xml:space="preserve">Every event received and every RADIUS packet forwarded — the normal activity trail. Also mirrored to stdout / the systemd journal.</w:t>
+              <w:t xml:space="preserve">Every event received and every RADIUS packet forwarded — type, user, mac, ip, session, ssid, usergroup, and traffic/duration stats when present. Also mirrored to stdout / the systemd journal.</w:t>
             </w:r>
           </w:p>
         </w:tc>
@@ -8171,7 +8430,7 @@
                 <w:sz w:val="19"/>
                 <w:szCs w:val="19"/>
               </w:rPr>
-              <w:t xml:space="preserve">ERROR-level and above only: failed RADIUS sends, malformed requests that raised exceptions, and any unhandled exception from the main thread or a request-handling thread — including full tracebacks that would otherwise only ever have gone to a console nobody is looking at.</w:t>
+              <w:t xml:space="preserve">ERROR-level and above only: failed RADIUS sends (including the session's usergroup, for correlating a failure to a specific role/policy), malformed requests that raised exceptions, and any unhandled exception from the main thread or a request-handling thread — including full tracebacks that would otherwise only ever have gone to a console nobody is looking at.</w:t>
             </w:r>
           </w:p>
         </w:tc>
@@ -8472,7 +8731,7 @@
                 <w:sz w:val="19"/>
                 <w:szCs w:val="19"/>
               </w:rPr>
-              <w:t xml:space="preserve">2026-07-20 12:18:04  INFO  RADIUS → 172.16.0.12:1813  type=NAC_ACCOUNTING_START</w:t>
+              <w:t xml:space="preserve">                           ssid=corp-wifi  usergroup=Employees</w:t>
             </w:r>
           </w:p>
           <w:p>
@@ -8485,7 +8744,20 @@
                 <w:sz w:val="19"/>
                 <w:szCs w:val="19"/>
               </w:rPr>
-              <w:t xml:space="preserve">                           session=0925DD44DCF80647  (104 bytes)</w:t>
+              <w:t xml:space="preserve">2026-07-20 12:18:04  INFO  RADIUS → 172.16.0.12:1813  type=NAC_ACCOUNTING_START</w:t>
+            </w:r>
+          </w:p>
+          <w:p>
+            <w:pPr>
+              <w:spacing w:after="0"/>
+            </w:pPr>
+            <w:r>
+              <w:rPr>
+                <w:rFonts w:ascii="Courier New" w:cs="Courier New" w:eastAsia="Courier New" w:hAnsi="Courier New"/>
+                <w:sz w:val="19"/>
+                <w:szCs w:val="19"/>
+              </w:rPr>
+              <w:t xml:space="preserve">                           session=0925DD44DCF80647  usergroup=Employees  (117 bytes)</w:t>
             </w:r>
           </w:p>
         </w:tc>
@@ -9615,7 +9887,7 @@
                 <w:sz w:val="19"/>
                 <w:szCs w:val="19"/>
               </w:rPr>
-              <w:t xml:space="preserve">Framed-IP-Address</w:t>
+              <w:t xml:space="preserve">Filter-Id</w:t>
             </w:r>
           </w:p>
         </w:tc>
@@ -9642,7 +9914,7 @@
                 <w:sz w:val="19"/>
                 <w:szCs w:val="19"/>
               </w:rPr>
-              <w:t xml:space="preserve">–</w:t>
+              <w:t xml:space="preserve">✓</w:t>
             </w:r>
           </w:p>
         </w:tc>
@@ -9723,7 +9995,7 @@
                 <w:sz w:val="19"/>
                 <w:szCs w:val="19"/>
               </w:rPr>
-              <w:t xml:space="preserve">172.16.10.79</w:t>
+              <w:t xml:space="preserve">Employees</w:t>
             </w:r>
           </w:p>
         </w:tc>
@@ -9752,7 +10024,7 @@
                 <w:sz w:val="19"/>
                 <w:szCs w:val="19"/>
               </w:rPr>
-              <w:t xml:space="preserve">Acct-Input-Octets</w:t>
+              <w:t xml:space="preserve">Framed-IP-Address</w:t>
             </w:r>
           </w:p>
         </w:tc>
@@ -9860,7 +10132,7 @@
                 <w:sz w:val="19"/>
                 <w:szCs w:val="19"/>
               </w:rPr>
-              <w:t xml:space="preserve">212166</w:t>
+              <w:t xml:space="preserve">172.16.10.79</w:t>
             </w:r>
           </w:p>
         </w:tc>
@@ -9889,7 +10161,7 @@
                 <w:sz w:val="19"/>
                 <w:szCs w:val="19"/>
               </w:rPr>
-              <w:t xml:space="preserve">Acct-Output-Octets</w:t>
+              <w:t xml:space="preserve">Acct-Input-Octets</w:t>
             </w:r>
           </w:p>
         </w:tc>
@@ -9997,7 +10269,7 @@
                 <w:sz w:val="19"/>
                 <w:szCs w:val="19"/>
               </w:rPr>
-              <w:t xml:space="preserve">210692</w:t>
+              <w:t xml:space="preserve">212166</w:t>
             </w:r>
           </w:p>
         </w:tc>
@@ -10026,7 +10298,7 @@
                 <w:sz w:val="19"/>
                 <w:szCs w:val="19"/>
               </w:rPr>
-              <w:t xml:space="preserve">Acct-Session-Time</w:t>
+              <w:t xml:space="preserve">Acct-Output-Octets</w:t>
             </w:r>
           </w:p>
         </w:tc>
@@ -10080,7 +10352,7 @@
                 <w:sz w:val="19"/>
                 <w:szCs w:val="19"/>
               </w:rPr>
-              <w:t xml:space="preserve">–</w:t>
+              <w:t xml:space="preserve">✓</w:t>
             </w:r>
           </w:p>
         </w:tc>
@@ -10134,7 +10406,7 @@
                 <w:sz w:val="19"/>
                 <w:szCs w:val="19"/>
               </w:rPr>
-              <w:t xml:space="preserve">120 (seconds)</w:t>
+              <w:t xml:space="preserve">210692</w:t>
             </w:r>
           </w:p>
         </w:tc>
@@ -10163,6 +10435,143 @@
                 <w:sz w:val="19"/>
                 <w:szCs w:val="19"/>
               </w:rPr>
+              <w:t xml:space="preserve">Acct-Session-Time</w:t>
+            </w:r>
+          </w:p>
+        </w:tc>
+        <w:tc>
+          <w:tcPr>
+            <w:tcW w:type="dxa" w:w="900"/>
+            <w:tcBorders>
+              <w:top w:val="single" w:color="BFBFBF" w:sz="2"/>
+              <w:left w:val="single" w:color="BFBFBF" w:sz="2"/>
+              <w:bottom w:val="single" w:color="BFBFBF" w:sz="2"/>
+              <w:right w:val="single" w:color="BFBFBF" w:sz="2"/>
+            </w:tcBorders>
+            <w:tcMar>
+              <w:top w:type="dxa" w:w="60"/>
+              <w:left w:type="dxa" w:w="100"/>
+              <w:bottom w:type="dxa" w:w="60"/>
+              <w:right w:type="dxa" w:w="100"/>
+            </w:tcMar>
+            <w:vAlign w:val="center"/>
+          </w:tcPr>
+          <w:p>
+            <w:r>
+              <w:rPr>
+                <w:sz w:val="19"/>
+                <w:szCs w:val="19"/>
+              </w:rPr>
+              <w:t xml:space="preserve">–</w:t>
+            </w:r>
+          </w:p>
+        </w:tc>
+        <w:tc>
+          <w:tcPr>
+            <w:tcW w:type="dxa" w:w="900"/>
+            <w:tcBorders>
+              <w:top w:val="single" w:color="BFBFBF" w:sz="2"/>
+              <w:left w:val="single" w:color="BFBFBF" w:sz="2"/>
+              <w:bottom w:val="single" w:color="BFBFBF" w:sz="2"/>
+              <w:right w:val="single" w:color="BFBFBF" w:sz="2"/>
+            </w:tcBorders>
+            <w:tcMar>
+              <w:top w:type="dxa" w:w="60"/>
+              <w:left w:type="dxa" w:w="100"/>
+              <w:bottom w:type="dxa" w:w="60"/>
+              <w:right w:type="dxa" w:w="100"/>
+            </w:tcMar>
+            <w:vAlign w:val="center"/>
+          </w:tcPr>
+          <w:p>
+            <w:r>
+              <w:rPr>
+                <w:sz w:val="19"/>
+                <w:szCs w:val="19"/>
+              </w:rPr>
+              <w:t xml:space="preserve">–</w:t>
+            </w:r>
+          </w:p>
+        </w:tc>
+        <w:tc>
+          <w:tcPr>
+            <w:tcW w:type="dxa" w:w="900"/>
+            <w:tcBorders>
+              <w:top w:val="single" w:color="BFBFBF" w:sz="2"/>
+              <w:left w:val="single" w:color="BFBFBF" w:sz="2"/>
+              <w:bottom w:val="single" w:color="BFBFBF" w:sz="2"/>
+              <w:right w:val="single" w:color="BFBFBF" w:sz="2"/>
+            </w:tcBorders>
+            <w:tcMar>
+              <w:top w:type="dxa" w:w="60"/>
+              <w:left w:type="dxa" w:w="100"/>
+              <w:bottom w:type="dxa" w:w="60"/>
+              <w:right w:type="dxa" w:w="100"/>
+            </w:tcMar>
+            <w:vAlign w:val="center"/>
+          </w:tcPr>
+          <w:p>
+            <w:r>
+              <w:rPr>
+                <w:sz w:val="19"/>
+                <w:szCs w:val="19"/>
+              </w:rPr>
+              <w:t xml:space="preserve">✓</w:t>
+            </w:r>
+          </w:p>
+        </w:tc>
+        <w:tc>
+          <w:tcPr>
+            <w:tcW w:type="dxa" w:w="3200"/>
+            <w:tcBorders>
+              <w:top w:val="single" w:color="BFBFBF" w:sz="2"/>
+              <w:left w:val="single" w:color="BFBFBF" w:sz="2"/>
+              <w:bottom w:val="single" w:color="BFBFBF" w:sz="2"/>
+              <w:right w:val="single" w:color="BFBFBF" w:sz="2"/>
+            </w:tcBorders>
+            <w:tcMar>
+              <w:top w:type="dxa" w:w="60"/>
+              <w:left w:type="dxa" w:w="100"/>
+              <w:bottom w:type="dxa" w:w="60"/>
+              <w:right w:type="dxa" w:w="100"/>
+            </w:tcMar>
+            <w:vAlign w:val="center"/>
+          </w:tcPr>
+          <w:p>
+            <w:r>
+              <w:rPr>
+                <w:sz w:val="19"/>
+                <w:szCs w:val="19"/>
+              </w:rPr>
+              <w:t xml:space="preserve">120 (seconds)</w:t>
+            </w:r>
+          </w:p>
+        </w:tc>
+      </w:tr>
+      <w:tr>
+        <w:tc>
+          <w:tcPr>
+            <w:tcW w:type="dxa" w:w="2400"/>
+            <w:tcBorders>
+              <w:top w:val="single" w:color="BFBFBF" w:sz="2"/>
+              <w:left w:val="single" w:color="BFBFBF" w:sz="2"/>
+              <w:bottom w:val="single" w:color="BFBFBF" w:sz="2"/>
+              <w:right w:val="single" w:color="BFBFBF" w:sz="2"/>
+            </w:tcBorders>
+            <w:tcMar>
+              <w:top w:type="dxa" w:w="60"/>
+              <w:left w:type="dxa" w:w="100"/>
+              <w:bottom w:type="dxa" w:w="60"/>
+              <w:right w:type="dxa" w:w="100"/>
+            </w:tcMar>
+            <w:vAlign w:val="center"/>
+          </w:tcPr>
+          <w:p>
+            <w:r>
+              <w:rPr>
+                <w:sz w:val="19"/>
+                <w:szCs w:val="19"/>
+              </w:rPr>
               <w:t xml:space="preserve">Acct-Terminate-Cause</w:t>
             </w:r>
           </w:p>
@@ -10287,7 +10696,7 @@
         <w:spacing w:after="160"/>
       </w:pPr>
       <w:r>
-        <w:t xml:space="preserve">Packet sizes from the confirmed capture: Start = 104 bytes, Interim-Update = 134 bytes, Stop = 146 bytes.</w:t>
+        <w:t xml:space="preserve">Packet sizes from the confirmed capture: Start = 104 bytes, Interim-Update = 134 bytes, Stop = 146 bytes (add the length of the usergroup value plus 2 bytes when Filter-Id is present).</w:t>
       </w:r>
     </w:p>
     <w:p>
@@ -10676,6 +11085,62 @@
       </w:pPr>
       <w:r>
         <w:t xml:space="preserve">This is expected behaviour. Mist does not include client_ip in NAC_ACCOUNTING_START events. Framed-IP-Address is only present in UPDATE and STOP. FortiGate RSSO will complete the identity mapping when the first UPDATE is received.</w:t>
+      </w:r>
+    </w:p>
+    <w:p>
+      <w:pPr>
+        <w:pStyle w:val="Heading3"/>
+        <w:spacing w:after="100" w:before="220"/>
+      </w:pPr>
+      <w:r>
+        <w:rPr>
+          <w:rFonts w:ascii="Arial" w:cs="Arial" w:eastAsia="Arial" w:hAnsi="Arial"/>
+          <w:b/>
+          <w:bCs/>
+          <w:color w:val="1F4D78"/>
+          <w:sz w:val="24"/>
+          <w:szCs w:val="24"/>
+        </w:rPr>
+        <w:t xml:space="preserve">Issue: Filter-Id / role missing or empty</w:t>
+      </w:r>
+    </w:p>
+    <w:p>
+      <w:pPr>
+        <w:pStyle w:val="ListParagraph"/>
+        <w:numPr>
+          <w:ilvl w:val="0"/>
+          <w:numId w:val="1"/>
+        </w:numPr>
+        <w:spacing w:after="80"/>
+      </w:pPr>
+      <w:r>
+        <w:t xml:space="preserve">Check nac_accounting_*.log for the event's usergroup value — if it shows usergroup=? or blank, Mist did not include a user group for that session, most likely because the matched NAC policy doesn't assign one. This is a Mist NAC policy question, not a forwarder issue.</w:t>
+      </w:r>
+    </w:p>
+    <w:p>
+      <w:pPr>
+        <w:pStyle w:val="ListParagraph"/>
+        <w:numPr>
+          <w:ilvl w:val="0"/>
+          <w:numId w:val="1"/>
+        </w:numPr>
+        <w:spacing w:after="80"/>
+      </w:pPr>
+      <w:r>
+        <w:t xml:space="preserve">Filter-Id is only added to the RADIUS packet when usergroup is non-empty (section 1.3) — its absence from a capture is expected in that case.</w:t>
+      </w:r>
+    </w:p>
+    <w:p>
+      <w:pPr>
+        <w:pStyle w:val="ListParagraph"/>
+        <w:numPr>
+          <w:ilvl w:val="0"/>
+          <w:numId w:val="1"/>
+        </w:numPr>
+        <w:spacing w:after="80"/>
+      </w:pPr>
+      <w:r>
+        <w:t xml:space="preserve">If usergroup is present in the log but you don't see it on the FortiGate side, confirm FortiGate is configured to read Filter-Id for that RSSO/RADIUS entry (section 6.4).</w:t>
       </w:r>
     </w:p>
     <w:p>

</xml_diff>

<commit_message>
Document the late-permit correction fix and broken-pipe logging fix
Guide bumped to v4.1: new section 22.4 walks through the real
FortiGate diagnostic ("RADIUS accounting profile not found: Missing
profile name", Carrier End Point falling back to the SSID) that
confirmed missing role and missing username were the same bug, plus
updated troubleshooting entries and expected log output showing the
Correction-Update(late permit) line. README updated to match, plus a
note on the BrokenPipeError logging fix.

Co-Authored-By: Claude Sonnet 5 <noreply@anthropic.com>
</commit_message>
<xml_diff>
--- a/Mist_NAC_RADIUS_Guide.docx
+++ b/Mist_NAC_RADIUS_Guide.docx
@@ -61,7 +61,7 @@
           <w:sz w:val="24"/>
           <w:szCs w:val="24"/>
         </w:rPr>
-        <w:t xml:space="preserve">Version 4.0</w:t>
+        <w:t xml:space="preserve">Version 4.1</w:t>
       </w:r>
     </w:p>
     <w:p>
@@ -16303,7 +16303,20 @@
         <w:spacing w:after="80"/>
       </w:pPr>
       <w:r>
-        <w:t xml:space="preserve">A session_id that already had its initial Start sent won't be sent a second one by a late or duplicate webhook delivery.</w:t>
+        <w:t xml:space="preserve">If the permit arrives after the timeout already sent a role-less Start — in practice the common case when nac-events consistently lags nac-accounting on a given network — an out-of-band correction Interim-Update is sent immediately with the newly-learned role/VLAN, instead of waiting for the next naturally-occurring Update/Stop. See section 22.4 for why this matters more than it might look like it should.</w:t>
+      </w:r>
+    </w:p>
+    <w:p>
+      <w:pPr>
+        <w:pStyle w:val="ListParagraph"/>
+        <w:numPr>
+          <w:ilvl w:val="0"/>
+          <w:numId w:val="1"/>
+        </w:numPr>
+        <w:spacing w:after="80"/>
+      </w:pPr>
+      <w:r>
+        <w:t xml:space="preserve">A session_id that already had its initial Start sent won't be sent a second one by a late or duplicate webhook delivery, and won't have more than one correction sent either.</w:t>
       </w:r>
     </w:p>
     <w:p>
@@ -18966,7 +18979,431 @@
         <w:t xml:space="preserve">Note: </w:t>
       </w:r>
       <w:r>
-        <w:t xml:space="preserve">Role/VLAN on a Start packet only appear if the permit event arrived — either correlated with the Start, or already cached from an earlier permit for this session_id. A Start sent after the correlation timeout with only the accounting half available has no role/VLAN, exactly like mist_nac_radius.py alone; if the permit shows up later, it still enriches that session's subsequent Update/Stop packets.</w:t>
+        <w:t xml:space="preserve">Role/VLAN on a Start packet only appear if the permit event arrived — either correlated with the Start, or already cached from an earlier permit for this session_id. A Start sent after the correlation timeout with only the accounting half available has no role/VLAN, exactly like mist_nac_radius.py alone; if the permit shows up later, it still enriches that session's subsequent Update/Stop packets, and now also triggers an immediate correction — see section 22.4.</w:t>
+      </w:r>
+    </w:p>
+    <w:p>
+      <w:pPr>
+        <w:pStyle w:val="Heading2"/>
+        <w:spacing w:after="120" w:before="280"/>
+      </w:pPr>
+      <w:r>
+        <w:rPr>
+          <w:rFonts w:ascii="Arial" w:cs="Arial" w:eastAsia="Arial" w:hAnsi="Arial"/>
+          <w:b/>
+          <w:bCs/>
+          <w:color w:val="1F3864"/>
+          <w:sz w:val="26"/>
+          <w:szCs w:val="26"/>
+        </w:rPr>
+        <w:t xml:space="preserve">22.4 Why a Missing Role Can Look Like a Missing Username</w:t>
+      </w:r>
+    </w:p>
+    <w:p>
+      <w:pPr>
+        <w:spacing w:after="160"/>
+      </w:pPr>
+      <w:r>
+        <w:t xml:space="preserve">On one real deployment, a packet capture showed roughly 91% of sessions falling back to the correlation timeout — the NAC_CLIENT_PERMIT event consistently arrived after the correlation window rather than within it. Before this correction mechanism existed, that meant those sessions' initial Start went out with no Filter-Id/Class at all, and the role only ever reached FortiGate if a later Update/Stop happened to arrive — which for some devices was a long time away, or never.</w:t>
+      </w:r>
+    </w:p>
+    <w:p>
+      <w:pPr>
+        <w:spacing w:after="160"/>
+      </w:pPr>
+      <w:r>
+        <w:t xml:space="preserve">The FortiGate-side symptom wasn't just a missing role, though. That FortiGate's own event log showed:</w:t>
+      </w:r>
+    </w:p>
+    <w:tbl>
+      <w:tblPr>
+        <w:tblW w:type="dxa" w:w="9000"/>
+        <w:tblBorders>
+          <w:top w:val="single" w:color="auto" w:sz="4"/>
+          <w:left w:val="single" w:color="auto" w:sz="4"/>
+          <w:bottom w:val="single" w:color="auto" w:sz="4"/>
+          <w:right w:val="single" w:color="auto" w:sz="4"/>
+          <w:insideH w:val="single" w:color="auto" w:sz="4"/>
+          <w:insideV w:val="single" w:color="auto" w:sz="4"/>
+        </w:tblBorders>
+      </w:tblPr>
+      <w:tblGrid>
+        <w:gridCol w:w="2200"/>
+        <w:gridCol w:w="3400"/>
+        <w:gridCol w:w="3400"/>
+      </w:tblGrid>
+      <w:tr>
+        <w:trPr>
+          <w:tblHeader/>
+        </w:trPr>
+        <w:tc>
+          <w:tcPr>
+            <w:tcW w:type="dxa" w:w="2200"/>
+            <w:tcBorders>
+              <w:top w:val="single" w:color="BFBFBF" w:sz="2"/>
+              <w:left w:val="single" w:color="BFBFBF" w:sz="2"/>
+              <w:bottom w:val="single" w:color="BFBFBF" w:sz="2"/>
+              <w:right w:val="single" w:color="BFBFBF" w:sz="2"/>
+            </w:tcBorders>
+            <w:shd w:fill="D9E2F3" w:val="clear"/>
+            <w:tcMar>
+              <w:top w:type="dxa" w:w="60"/>
+              <w:left w:type="dxa" w:w="100"/>
+              <w:bottom w:type="dxa" w:w="60"/>
+              <w:right w:type="dxa" w:w="100"/>
+            </w:tcMar>
+            <w:vAlign w:val="center"/>
+          </w:tcPr>
+          <w:p>
+            <w:r>
+              <w:rPr>
+                <w:rFonts w:ascii="Arial" w:cs="Arial" w:eastAsia="Arial" w:hAnsi="Arial"/>
+                <w:b/>
+                <w:bCs/>
+                <w:sz w:val="19"/>
+                <w:szCs w:val="19"/>
+              </w:rPr>
+              <w:t xml:space="preserve">Field</w:t>
+            </w:r>
+          </w:p>
+        </w:tc>
+        <w:tc>
+          <w:tcPr>
+            <w:tcW w:type="dxa" w:w="3400"/>
+            <w:tcBorders>
+              <w:top w:val="single" w:color="BFBFBF" w:sz="2"/>
+              <w:left w:val="single" w:color="BFBFBF" w:sz="2"/>
+              <w:bottom w:val="single" w:color="BFBFBF" w:sz="2"/>
+              <w:right w:val="single" w:color="BFBFBF" w:sz="2"/>
+            </w:tcBorders>
+            <w:shd w:fill="D9E2F3" w:val="clear"/>
+            <w:tcMar>
+              <w:top w:type="dxa" w:w="60"/>
+              <w:left w:type="dxa" w:w="100"/>
+              <w:bottom w:type="dxa" w:w="60"/>
+              <w:right w:type="dxa" w:w="100"/>
+            </w:tcMar>
+            <w:vAlign w:val="center"/>
+          </w:tcPr>
+          <w:p>
+            <w:r>
+              <w:rPr>
+                <w:rFonts w:ascii="Arial" w:cs="Arial" w:eastAsia="Arial" w:hAnsi="Arial"/>
+                <w:b/>
+                <w:bCs/>
+                <w:sz w:val="19"/>
+                <w:szCs w:val="19"/>
+              </w:rPr>
+              <w:t xml:space="preserve">Working session</w:t>
+            </w:r>
+          </w:p>
+        </w:tc>
+        <w:tc>
+          <w:tcPr>
+            <w:tcW w:type="dxa" w:w="3400"/>
+            <w:tcBorders>
+              <w:top w:val="single" w:color="BFBFBF" w:sz="2"/>
+              <w:left w:val="single" w:color="BFBFBF" w:sz="2"/>
+              <w:bottom w:val="single" w:color="BFBFBF" w:sz="2"/>
+              <w:right w:val="single" w:color="BFBFBF" w:sz="2"/>
+            </w:tcBorders>
+            <w:shd w:fill="D9E2F3" w:val="clear"/>
+            <w:tcMar>
+              <w:top w:type="dxa" w:w="60"/>
+              <w:left w:type="dxa" w:w="100"/>
+              <w:bottom w:type="dxa" w:w="60"/>
+              <w:right w:type="dxa" w:w="100"/>
+            </w:tcMar>
+            <w:vAlign w:val="center"/>
+          </w:tcPr>
+          <w:p>
+            <w:r>
+              <w:rPr>
+                <w:rFonts w:ascii="Arial" w:cs="Arial" w:eastAsia="Arial" w:hAnsi="Arial"/>
+                <w:b/>
+                <w:bCs/>
+                <w:sz w:val="19"/>
+                <w:szCs w:val="19"/>
+              </w:rPr>
+              <w:t xml:space="preserve">Affected session</w:t>
+            </w:r>
+          </w:p>
+        </w:tc>
+      </w:tr>
+      <w:tr>
+        <w:tc>
+          <w:tcPr>
+            <w:tcW w:type="dxa" w:w="2200"/>
+            <w:tcBorders>
+              <w:top w:val="single" w:color="BFBFBF" w:sz="2"/>
+              <w:left w:val="single" w:color="BFBFBF" w:sz="2"/>
+              <w:bottom w:val="single" w:color="BFBFBF" w:sz="2"/>
+              <w:right w:val="single" w:color="BFBFBF" w:sz="2"/>
+            </w:tcBorders>
+            <w:tcMar>
+              <w:top w:type="dxa" w:w="60"/>
+              <w:left w:type="dxa" w:w="100"/>
+              <w:bottom w:type="dxa" w:w="60"/>
+              <w:right w:type="dxa" w:w="100"/>
+            </w:tcMar>
+            <w:vAlign w:val="center"/>
+          </w:tcPr>
+          <w:p>
+            <w:r>
+              <w:rPr>
+                <w:sz w:val="19"/>
+                <w:szCs w:val="19"/>
+              </w:rPr>
+              <w:t xml:space="preserve">Log Description</w:t>
+            </w:r>
+          </w:p>
+        </w:tc>
+        <w:tc>
+          <w:tcPr>
+            <w:tcW w:type="dxa" w:w="3400"/>
+            <w:tcBorders>
+              <w:top w:val="single" w:color="BFBFBF" w:sz="2"/>
+              <w:left w:val="single" w:color="BFBFBF" w:sz="2"/>
+              <w:bottom w:val="single" w:color="BFBFBF" w:sz="2"/>
+              <w:right w:val="single" w:color="BFBFBF" w:sz="2"/>
+            </w:tcBorders>
+            <w:tcMar>
+              <w:top w:type="dxa" w:w="60"/>
+              <w:left w:type="dxa" w:w="100"/>
+              <w:bottom w:type="dxa" w:w="60"/>
+              <w:right w:type="dxa" w:w="100"/>
+            </w:tcMar>
+            <w:vAlign w:val="center"/>
+          </w:tcPr>
+          <w:p>
+            <w:r>
+              <w:rPr>
+                <w:sz w:val="19"/>
+                <w:szCs w:val="19"/>
+              </w:rPr>
+              <w:t xml:space="preserve">RADIUS accounting event</w:t>
+            </w:r>
+          </w:p>
+        </w:tc>
+        <w:tc>
+          <w:tcPr>
+            <w:tcW w:type="dxa" w:w="3400"/>
+            <w:tcBorders>
+              <w:top w:val="single" w:color="BFBFBF" w:sz="2"/>
+              <w:left w:val="single" w:color="BFBFBF" w:sz="2"/>
+              <w:bottom w:val="single" w:color="BFBFBF" w:sz="2"/>
+              <w:right w:val="single" w:color="BFBFBF" w:sz="2"/>
+            </w:tcBorders>
+            <w:tcMar>
+              <w:top w:type="dxa" w:w="60"/>
+              <w:left w:type="dxa" w:w="100"/>
+              <w:bottom w:type="dxa" w:w="60"/>
+              <w:right w:type="dxa" w:w="100"/>
+            </w:tcMar>
+            <w:vAlign w:val="center"/>
+          </w:tcPr>
+          <w:p>
+            <w:r>
+              <w:rPr>
+                <w:sz w:val="19"/>
+                <w:szCs w:val="19"/>
+              </w:rPr>
+              <w:t xml:space="preserve">RADIUS accounting profile not found</w:t>
+            </w:r>
+          </w:p>
+        </w:tc>
+      </w:tr>
+      <w:tr>
+        <w:tc>
+          <w:tcPr>
+            <w:tcW w:type="dxa" w:w="2200"/>
+            <w:tcBorders>
+              <w:top w:val="single" w:color="BFBFBF" w:sz="2"/>
+              <w:left w:val="single" w:color="BFBFBF" w:sz="2"/>
+              <w:bottom w:val="single" w:color="BFBFBF" w:sz="2"/>
+              <w:right w:val="single" w:color="BFBFBF" w:sz="2"/>
+            </w:tcBorders>
+            <w:tcMar>
+              <w:top w:type="dxa" w:w="60"/>
+              <w:left w:type="dxa" w:w="100"/>
+              <w:bottom w:type="dxa" w:w="60"/>
+              <w:right w:type="dxa" w:w="100"/>
+            </w:tcMar>
+            <w:vAlign w:val="center"/>
+          </w:tcPr>
+          <w:p>
+            <w:r>
+              <w:rPr>
+                <w:sz w:val="19"/>
+                <w:szCs w:val="19"/>
+              </w:rPr>
+              <w:t xml:space="preserve">Reason</w:t>
+            </w:r>
+          </w:p>
+        </w:tc>
+        <w:tc>
+          <w:tcPr>
+            <w:tcW w:type="dxa" w:w="3400"/>
+            <w:tcBorders>
+              <w:top w:val="single" w:color="BFBFBF" w:sz="2"/>
+              <w:left w:val="single" w:color="BFBFBF" w:sz="2"/>
+              <w:bottom w:val="single" w:color="BFBFBF" w:sz="2"/>
+              <w:right w:val="single" w:color="BFBFBF" w:sz="2"/>
+            </w:tcBorders>
+            <w:tcMar>
+              <w:top w:type="dxa" w:w="60"/>
+              <w:left w:type="dxa" w:w="100"/>
+              <w:bottom w:type="dxa" w:w="60"/>
+              <w:right w:type="dxa" w:w="100"/>
+            </w:tcMar>
+            <w:vAlign w:val="center"/>
+          </w:tcPr>
+          <w:p>
+            <w:r>
+              <w:rPr>
+                <w:sz w:val="19"/>
+                <w:szCs w:val="19"/>
+              </w:rPr>
+              <w:t xml:space="preserve">(none)</w:t>
+            </w:r>
+          </w:p>
+        </w:tc>
+        <w:tc>
+          <w:tcPr>
+            <w:tcW w:type="dxa" w:w="3400"/>
+            <w:tcBorders>
+              <w:top w:val="single" w:color="BFBFBF" w:sz="2"/>
+              <w:left w:val="single" w:color="BFBFBF" w:sz="2"/>
+              <w:bottom w:val="single" w:color="BFBFBF" w:sz="2"/>
+              <w:right w:val="single" w:color="BFBFBF" w:sz="2"/>
+            </w:tcBorders>
+            <w:tcMar>
+              <w:top w:type="dxa" w:w="60"/>
+              <w:left w:type="dxa" w:w="100"/>
+              <w:bottom w:type="dxa" w:w="60"/>
+              <w:right w:type="dxa" w:w="100"/>
+            </w:tcMar>
+            <w:vAlign w:val="center"/>
+          </w:tcPr>
+          <w:p>
+            <w:r>
+              <w:rPr>
+                <w:sz w:val="19"/>
+                <w:szCs w:val="19"/>
+              </w:rPr>
+              <w:t xml:space="preserve">Missing profile name</w:t>
+            </w:r>
+          </w:p>
+        </w:tc>
+      </w:tr>
+      <w:tr>
+        <w:tc>
+          <w:tcPr>
+            <w:tcW w:type="dxa" w:w="2200"/>
+            <w:tcBorders>
+              <w:top w:val="single" w:color="BFBFBF" w:sz="2"/>
+              <w:left w:val="single" w:color="BFBFBF" w:sz="2"/>
+              <w:bottom w:val="single" w:color="BFBFBF" w:sz="2"/>
+              <w:right w:val="single" w:color="BFBFBF" w:sz="2"/>
+            </w:tcBorders>
+            <w:tcMar>
+              <w:top w:type="dxa" w:w="60"/>
+              <w:left w:type="dxa" w:w="100"/>
+              <w:bottom w:type="dxa" w:w="60"/>
+              <w:right w:type="dxa" w:w="100"/>
+            </w:tcMar>
+            <w:vAlign w:val="center"/>
+          </w:tcPr>
+          <w:p>
+            <w:r>
+              <w:rPr>
+                <w:sz w:val="19"/>
+                <w:szCs w:val="19"/>
+              </w:rPr>
+              <w:t xml:space="preserve">Carrier End Point</w:t>
+            </w:r>
+          </w:p>
+        </w:tc>
+        <w:tc>
+          <w:tcPr>
+            <w:tcW w:type="dxa" w:w="3400"/>
+            <w:tcBorders>
+              <w:top w:val="single" w:color="BFBFBF" w:sz="2"/>
+              <w:left w:val="single" w:color="BFBFBF" w:sz="2"/>
+              <w:bottom w:val="single" w:color="BFBFBF" w:sz="2"/>
+              <w:right w:val="single" w:color="BFBFBF" w:sz="2"/>
+            </w:tcBorders>
+            <w:tcMar>
+              <w:top w:type="dxa" w:w="60"/>
+              <w:left w:type="dxa" w:w="100"/>
+              <w:bottom w:type="dxa" w:w="60"/>
+              <w:right w:type="dxa" w:w="100"/>
+            </w:tcMar>
+            <w:vAlign w:val="center"/>
+          </w:tcPr>
+          <w:p>
+            <w:r>
+              <w:rPr>
+                <w:sz w:val="19"/>
+                <w:szCs w:val="19"/>
+              </w:rPr>
+              <w:t xml:space="preserve">the correct username</w:t>
+            </w:r>
+          </w:p>
+        </w:tc>
+        <w:tc>
+          <w:tcPr>
+            <w:tcW w:type="dxa" w:w="3400"/>
+            <w:tcBorders>
+              <w:top w:val="single" w:color="BFBFBF" w:sz="2"/>
+              <w:left w:val="single" w:color="BFBFBF" w:sz="2"/>
+              <w:bottom w:val="single" w:color="BFBFBF" w:sz="2"/>
+              <w:right w:val="single" w:color="BFBFBF" w:sz="2"/>
+            </w:tcBorders>
+            <w:tcMar>
+              <w:top w:type="dxa" w:w="60"/>
+              <w:left w:type="dxa" w:w="100"/>
+              <w:bottom w:type="dxa" w:w="60"/>
+              <w:right w:type="dxa" w:w="100"/>
+            </w:tcMar>
+            <w:vAlign w:val="center"/>
+          </w:tcPr>
+          <w:p>
+            <w:r>
+              <w:rPr>
+                <w:sz w:val="19"/>
+                <w:szCs w:val="19"/>
+              </w:rPr>
+              <w:t xml:space="preserve">the SSID name, not a username</w:t>
+            </w:r>
+          </w:p>
+        </w:tc>
+      </w:tr>
+    </w:tbl>
+    <w:p>
+      <w:pPr>
+        <w:spacing w:after="120"/>
+      </w:pPr>
+    </w:p>
+    <w:p>
+      <w:pPr>
+        <w:pBdr>
+          <w:left w:val="single" w:color="C0392B" w:sz="16"/>
+        </w:pBdr>
+        <w:shd w:fill="FCE4E4" w:val="clear"/>
+        <w:spacing w:after="200" w:before="80"/>
+        <w:ind w:left="120"/>
+      </w:pPr>
+      <w:r>
+        <w:rPr>
+          <w:b/>
+          <w:bCs/>
+          <w:color w:val="C0392B"/>
+        </w:rPr>
+        <w:t xml:space="preserve">Important: </w:t>
+      </w:r>
+      <w:r>
+        <w:t xml:space="preserve">If you see "RADIUS accounting profile not found: Missing profile name" in FortiGate's own logs, with the username effectively blank or replaced by something like the SSID name, this is very likely the same underlying cause: FortiGate's identity/profile resolution here depends on Class (or Filter-Id, depending on configuration) being present to resolve identity at all — not just to assign a group. A session stuck without one isn't just missing a role in this case, its username effectively fails to resolve too. Confirm the correction (section 22.1) reaches FortiGate by checking for Correction-Update(late permit) lines in nac_combined_*.log, or re-run the same FortiGate diagnostics (diagnose firewall auth list, or the equivalent log view) against a session that previously showed this error.</w:t>
       </w:r>
     </w:p>
     <w:p>
@@ -23198,7 +23635,7 @@
                 <w:sz w:val="19"/>
                 <w:szCs w:val="19"/>
               </w:rPr>
-              <w:t xml:space="preserve">Every event received on both topics, every RADIUS packet sent (Start/Update/Stop), and which correlation path produced each Start (correlated, permit-only timeout, or accounting-only timeout).</w:t>
+              <w:t xml:space="preserve">Every event received on both topics, every RADIUS packet sent (Start/Update/Stop), which correlation path produced each Start (correlated, permit-only timeout, or accounting-only timeout), and any Correction-Update(late permit) sent for a session whose Start went out role-less.</w:t>
             </w:r>
           </w:p>
         </w:tc>
@@ -23282,7 +23719,7 @@
         <w:t xml:space="preserve">Note: </w:t>
       </w:r>
       <w:r>
-        <w:t xml:space="preserve">Correlation and enrichment state is in-memory only. A restart clears any sessions mid-correlation (they'll simply be treated as new when the next event for that session_id arrives) and any cached role/VLAN enrichment (that session's next Update/Stop won't carry Filter-Id/Class/VLAN until a fresh permit event repopulates it, if one ever comes — nac-events only fires once per session, at the start).</w:t>
+        <w:t xml:space="preserve">Correlation and enrichment state is in-memory only. A restart clears any sessions mid-correlation (they'll simply be treated as new when the next event for that session_id arrives), any cached role/VLAN enrichment, and the record of which sessions have already been sent a correction (so a permit arriving just after a restart, for a session whose Start went out before the restart, will trigger a fresh correction rather than being suppressed as a duplicate — this is intentional, since the pre-restart correction state is gone either way).</w:t>
       </w:r>
     </w:p>
     <w:p>
@@ -23442,25 +23879,13 @@
         <w:spacing w:after="160"/>
       </w:pPr>
       <w:r>
-        <w:t xml:space="preserve">The (accounting+permit, correlated) tag confirms both halves arrived and were merged. (permit-only, timeout) or (accounting-only, timeout) mean only one half showed up within the correlation window — check the other topic's webhook delivery in the Mist dashboard if you expect to see the merged form consistently.</w:t>
-      </w:r>
-    </w:p>
-    <w:p>
-      <w:pPr>
-        <w:pStyle w:val="Heading2"/>
-        <w:spacing w:after="120" w:before="280"/>
-      </w:pPr>
-      <w:r>
-        <w:rPr>
-          <w:rFonts w:ascii="Arial" w:cs="Arial" w:eastAsia="Arial" w:hAnsi="Arial"/>
-          <w:b/>
-          <w:bCs/>
-          <w:color w:val="1F3864"/>
-          <w:sz w:val="26"/>
-          <w:szCs w:val="26"/>
-        </w:rPr>
-        <w:t xml:space="preserve">30.2 Verify with Wireshark</w:t>
-      </w:r>
+        <w:t xml:space="preserve">The (accounting+permit, correlated) tag confirms both halves arrived and were merged. (permit-only, timeout) or (accounting-only, timeout) mean only one half showed up within the correlation window — check the other topic's webhook delivery in the Mist dashboard if you expect to see the merged form consistently. A late permit against an (accounting-only, timeout) Start produces a follow-up Correction-Update(late permit) line for the same session, shortly after:</w:t>
+      </w:r>
+    </w:p>
+    <w:p>
+      <w:pPr>
+        <w:spacing w:after="120"/>
+      </w:pPr>
     </w:p>
     <w:tbl>
       <w:tblPr>
@@ -23504,6 +23929,136 @@
                 <w:sz w:val="19"/>
                 <w:szCs w:val="19"/>
               </w:rPr>
+              <w:t xml:space="preserve">2026-07-22 16:47:36  INFO  RADIUS → 172.16.0.12:1813  type=Start(accounting-only, timeout)</w:t>
+            </w:r>
+          </w:p>
+          <w:p>
+            <w:pPr>
+              <w:spacing w:after="0"/>
+            </w:pPr>
+            <w:r>
+              <w:rPr>
+                <w:rFonts w:ascii="Courier New" w:cs="Courier New" w:eastAsia="Courier New" w:hAnsi="Courier New"/>
+                <w:sz w:val="19"/>
+                <w:szCs w:val="19"/>
+              </w:rPr>
+              <w:t xml:space="preserve">                          session=SESS-REAL  user=user1@keeley.org.uk  group_role=? (103 bytes)</w:t>
+            </w:r>
+          </w:p>
+          <w:p>
+            <w:pPr>
+              <w:spacing w:after="0"/>
+            </w:pPr>
+            <w:r>
+              <w:rPr>
+                <w:rFonts w:ascii="Courier New" w:cs="Courier New" w:eastAsia="Courier New" w:hAnsi="Courier New"/>
+                <w:sz w:val="19"/>
+                <w:szCs w:val="19"/>
+              </w:rPr>
+              <w:t xml:space="preserve">2026-07-22 16:47:37  INFO  type=NAC_CLIENT_PERMIT  user=user1@keeley.org.uk  mac=2e68943e8538</w:t>
+            </w:r>
+          </w:p>
+          <w:p>
+            <w:pPr>
+              <w:spacing w:after="0"/>
+            </w:pPr>
+            <w:r>
+              <w:rPr>
+                <w:rFonts w:ascii="Courier New" w:cs="Courier New" w:eastAsia="Courier New" w:hAnsi="Courier New"/>
+                <w:sz w:val="19"/>
+                <w:szCs w:val="19"/>
+              </w:rPr>
+              <w:t xml:space="preserve">                          session=SESS-REAL  vlan=101  group_role=Home_User</w:t>
+            </w:r>
+          </w:p>
+          <w:p>
+            <w:pPr>
+              <w:spacing w:after="0"/>
+            </w:pPr>
+            <w:r>
+              <w:rPr>
+                <w:rFonts w:ascii="Courier New" w:cs="Courier New" w:eastAsia="Courier New" w:hAnsi="Courier New"/>
+                <w:sz w:val="19"/>
+                <w:szCs w:val="19"/>
+              </w:rPr>
+              <w:t xml:space="preserve">2026-07-22 16:47:37  INFO  RADIUS → 172.16.0.12:1813  type=Correction-Update(late permit)</w:t>
+            </w:r>
+          </w:p>
+          <w:p>
+            <w:pPr>
+              <w:spacing w:after="0"/>
+            </w:pPr>
+            <w:r>
+              <w:rPr>
+                <w:rFonts w:ascii="Courier New" w:cs="Courier New" w:eastAsia="Courier New" w:hAnsi="Courier New"/>
+                <w:sz w:val="19"/>
+                <w:szCs w:val="19"/>
+              </w:rPr>
+              <w:t xml:space="preserve">                          session=SESS-REAL  user=user1@keeley.org.uk  group_role=Home_User (143 bytes)</w:t>
+            </w:r>
+          </w:p>
+        </w:tc>
+      </w:tr>
+    </w:tbl>
+    <w:p>
+      <w:pPr>
+        <w:pStyle w:val="Heading2"/>
+        <w:spacing w:after="120" w:before="280"/>
+      </w:pPr>
+      <w:r>
+        <w:rPr>
+          <w:rFonts w:ascii="Arial" w:cs="Arial" w:eastAsia="Arial" w:hAnsi="Arial"/>
+          <w:b/>
+          <w:bCs/>
+          <w:color w:val="1F3864"/>
+          <w:sz w:val="26"/>
+          <w:szCs w:val="26"/>
+        </w:rPr>
+        <w:t xml:space="preserve">30.2 Verify with Wireshark</w:t>
+      </w:r>
+    </w:p>
+    <w:tbl>
+      <w:tblPr>
+        <w:tblW w:type="pct" w:w="100%"/>
+        <w:tblBorders>
+          <w:top w:val="single" w:color="auto" w:sz="4"/>
+          <w:left w:val="single" w:color="auto" w:sz="4"/>
+          <w:bottom w:val="single" w:color="auto" w:sz="4"/>
+          <w:right w:val="single" w:color="auto" w:sz="4"/>
+          <w:insideH w:val="single" w:color="auto" w:sz="4"/>
+          <w:insideV w:val="single" w:color="auto" w:sz="4"/>
+        </w:tblBorders>
+      </w:tblPr>
+      <w:tblGrid>
+        <w:gridCol w:w="100"/>
+      </w:tblGrid>
+      <w:tr>
+        <w:tc>
+          <w:tcPr>
+            <w:tcBorders>
+              <w:top w:val="single" w:color="BFBFBF" w:sz="2"/>
+              <w:left w:val="single" w:color="BFBFBF" w:sz="2"/>
+              <w:bottom w:val="single" w:color="BFBFBF" w:sz="2"/>
+              <w:right w:val="single" w:color="BFBFBF" w:sz="2"/>
+            </w:tcBorders>
+            <w:shd w:fill="F2F2F2" w:val="clear"/>
+            <w:tcMar>
+              <w:top w:type="dxa" w:w="100"/>
+              <w:left w:type="dxa" w:w="150"/>
+              <w:bottom w:type="dxa" w:w="100"/>
+              <w:right w:type="dxa" w:w="150"/>
+            </w:tcMar>
+          </w:tcPr>
+          <w:p>
+            <w:pPr>
+              <w:spacing w:after="0"/>
+            </w:pPr>
+            <w:r>
+              <w:rPr>
+                <w:rFonts w:ascii="Courier New" w:cs="Courier New" w:eastAsia="Courier New" w:hAnsi="Courier New"/>
+                <w:sz w:val="19"/>
+                <w:szCs w:val="19"/>
+              </w:rPr>
               <w:t xml:space="preserve">sudo tcpdump -i any -n udp port 1813 -w /tmp/radius_combined_test.pcap</w:t>
             </w:r>
           </w:p>
@@ -23567,7 +24122,7 @@
         <w:spacing w:after="80"/>
       </w:pPr>
       <w:r>
-        <w:t xml:space="preserve">Check nac_combined_*.log for the (accounting+permit, correlated) tag on that session — if it instead shows (accounting-only, timeout), the permit event never arrived within start_correlation_timeout_seconds. Confirm both Mist webhooks (or the one multi-topic webhook) are actually configured and delivering — check the Mist dashboard's webhook delivery status.</w:t>
+        <w:t xml:space="preserve">Check nac_combined_*.log for the (accounting+permit, correlated) tag on that session — if it instead shows (accounting-only, timeout), the permit event didn't arrive within start_correlation_timeout_seconds. This is expected to self-correct: look for a follow-up Correction-Update(late permit) line for the same session shortly after (section 30.1) — if that's present, the role did reach FortiGate, just slightly later than the Start.</w:t>
       </w:r>
     </w:p>
     <w:p>
@@ -23580,7 +24135,32 @@
         <w:spacing w:after="80"/>
       </w:pPr>
       <w:r>
-        <w:t xml:space="preserve">If permits are consistently arriving after the timeout, increase start_correlation_timeout_seconds rather than assuming something is broken — some environments may see more separation between the two events than the 5-second default assumes.</w:t>
+        <w:t xml:space="preserve">If neither a correlated Start nor a Correction-Update ever appears for a session, the permit event isn't arriving at all, not just late. Confirm both Mist webhooks (or the one multi-topic webhook) are actually configured and delivering — check the Mist dashboard's webhook delivery status.</w:t>
+      </w:r>
+    </w:p>
+    <w:p>
+      <w:pPr>
+        <w:pStyle w:val="Heading3"/>
+        <w:spacing w:after="100" w:before="220"/>
+      </w:pPr>
+      <w:r>
+        <w:rPr>
+          <w:rFonts w:ascii="Arial" w:cs="Arial" w:eastAsia="Arial" w:hAnsi="Arial"/>
+          <w:b/>
+          <w:bCs/>
+          <w:color w:val="1F4D78"/>
+          <w:sz w:val="24"/>
+          <w:szCs w:val="24"/>
+        </w:rPr>
+        <w:t xml:space="preserve">Issue: FortiGate shows a blank or wrong username, or logs "RADIUS accounting profile not found"</w:t>
+      </w:r>
+    </w:p>
+    <w:p>
+      <w:pPr>
+        <w:spacing w:after="160"/>
+      </w:pPr>
+      <w:r>
+        <w:t xml:space="preserve">See section 22.4 — on at least one real deployment this turned out to be the same root cause as missing role/VLAN, not a separate username bug. Confirm a Correction-Update(late permit) line exists for the affected session in nac_combined_*.log; if it does, re-check the FortiGate log/view for that session afterward.</w:t>
       </w:r>
     </w:p>
     <w:p>

</xml_diff>